<commit_message>
Adding the Kubernetes notes
</commit_message>
<xml_diff>
--- a/Docker-And-Docker-Compose-And-Kubernetes-And-DevOps/Kubernetes-My-Notes-01/Kubernetes-Notes-03.docx
+++ b/Docker-And-Docker-Compose-And-Kubernetes-And-DevOps/Kubernetes-My-Notes-01/Kubernetes-Notes-03.docx
@@ -2196,6 +2196,618 @@
           <w:szCs w:val="28"/>
         </w:rPr>
         <w:t>is similar but uses file paths instead of labels and focuses on processes rather than users.</w:t>
+      </w:r>
+    </w:p>
+    <w:p>
+      <w:pPr>
+        <w:ind w:left="720" w:firstLine="720"/>
+        <w:rPr>
+          <w:rFonts w:ascii="Sakkal Majalla" w:hAnsi="Sakkal Majalla" w:cs="Sakkal Majalla"/>
+          <w:sz w:val="28"/>
+          <w:szCs w:val="28"/>
+        </w:rPr>
+      </w:pPr>
+      <w:r>
+        <w:rPr>
+          <w:rFonts w:ascii="Sakkal Majalla" w:hAnsi="Sakkal Majalla" w:cs="Sakkal Majalla"/>
+          <w:sz w:val="28"/>
+          <w:szCs w:val="28"/>
+        </w:rPr>
+        <w:t>=================================================</w:t>
+      </w:r>
+    </w:p>
+    <w:p>
+      <w:pPr>
+        <w:rPr>
+          <w:rFonts w:ascii="Sakkal Majalla" w:hAnsi="Sakkal Majalla" w:cs="Sakkal Majalla"/>
+          <w:sz w:val="28"/>
+          <w:szCs w:val="28"/>
+        </w:rPr>
+      </w:pPr>
+      <w:r>
+        <w:rPr>
+          <w:noProof/>
+        </w:rPr>
+        <w:drawing>
+          <wp:inline distT="0" distB="0" distL="0" distR="0" wp14:anchorId="2ADF49A0" wp14:editId="7A8D62B8">
+            <wp:extent cx="5943600" cy="4149090"/>
+            <wp:effectExtent l="0" t="0" r="0" b="3810"/>
+            <wp:docPr id="1542701019" name="Picture 1"/>
+            <wp:cNvGraphicFramePr>
+              <a:graphicFrameLocks xmlns:a="http://schemas.openxmlformats.org/drawingml/2006/main" noChangeAspect="1"/>
+            </wp:cNvGraphicFramePr>
+            <a:graphic xmlns:a="http://schemas.openxmlformats.org/drawingml/2006/main">
+              <a:graphicData uri="http://schemas.openxmlformats.org/drawingml/2006/picture">
+                <pic:pic xmlns:pic="http://schemas.openxmlformats.org/drawingml/2006/picture">
+                  <pic:nvPicPr>
+                    <pic:cNvPr id="1542701019" name=""/>
+                    <pic:cNvPicPr/>
+                  </pic:nvPicPr>
+                  <pic:blipFill>
+                    <a:blip r:embed="rId9"/>
+                    <a:stretch>
+                      <a:fillRect/>
+                    </a:stretch>
+                  </pic:blipFill>
+                  <pic:spPr>
+                    <a:xfrm>
+                      <a:off x="0" y="0"/>
+                      <a:ext cx="5943600" cy="4149090"/>
+                    </a:xfrm>
+                    <a:prstGeom prst="rect">
+                      <a:avLst/>
+                    </a:prstGeom>
+                  </pic:spPr>
+                </pic:pic>
+              </a:graphicData>
+            </a:graphic>
+          </wp:inline>
+        </w:drawing>
+      </w:r>
+    </w:p>
+    <w:p>
+      <w:pPr>
+        <w:ind w:left="720" w:firstLine="720"/>
+        <w:rPr>
+          <w:rFonts w:ascii="Sakkal Majalla" w:hAnsi="Sakkal Majalla" w:cs="Sakkal Majalla"/>
+          <w:sz w:val="28"/>
+          <w:szCs w:val="28"/>
+        </w:rPr>
+      </w:pPr>
+      <w:r>
+        <w:rPr>
+          <w:rFonts w:ascii="Sakkal Majalla" w:hAnsi="Sakkal Majalla" w:cs="Sakkal Majalla"/>
+          <w:sz w:val="28"/>
+          <w:szCs w:val="28"/>
+        </w:rPr>
+        <w:t>=================================================</w:t>
+      </w:r>
+    </w:p>
+    <w:p>
+      <w:pPr>
+        <w:rPr>
+          <w:rFonts w:ascii="Sakkal Majalla" w:hAnsi="Sakkal Majalla" w:cs="Sakkal Majalla"/>
+          <w:sz w:val="28"/>
+          <w:szCs w:val="28"/>
+        </w:rPr>
+      </w:pPr>
+      <w:r>
+        <w:rPr>
+          <w:rFonts w:ascii="Sakkal Majalla" w:hAnsi="Sakkal Majalla" w:cs="Sakkal Majalla"/>
+          <w:b/>
+          <w:bCs/>
+          <w:color w:val="538135" w:themeColor="accent6" w:themeShade="BF"/>
+          <w:sz w:val="28"/>
+          <w:szCs w:val="28"/>
+        </w:rPr>
+        <w:t>Kubelet</w:t>
+      </w:r>
+      <w:r>
+        <w:rPr>
+          <w:rFonts w:ascii="Sakkal Majalla" w:hAnsi="Sakkal Majalla" w:cs="Sakkal Majalla"/>
+          <w:color w:val="538135" w:themeColor="accent6" w:themeShade="BF"/>
+          <w:sz w:val="28"/>
+          <w:szCs w:val="28"/>
+        </w:rPr>
+        <w:t xml:space="preserve"> </w:t>
+      </w:r>
+      <w:r>
+        <w:rPr>
+          <w:rFonts w:ascii="Sakkal Majalla" w:hAnsi="Sakkal Majalla" w:cs="Sakkal Majalla"/>
+          <w:sz w:val="28"/>
+          <w:szCs w:val="28"/>
+        </w:rPr>
+        <w:t>- the Kubernetes agent that manages the node.</w:t>
+      </w:r>
+    </w:p>
+    <w:p>
+      <w:pPr>
+        <w:ind w:left="720" w:firstLine="720"/>
+        <w:rPr>
+          <w:rFonts w:ascii="Sakkal Majalla" w:hAnsi="Sakkal Majalla" w:cs="Sakkal Majalla"/>
+          <w:sz w:val="28"/>
+          <w:szCs w:val="28"/>
+        </w:rPr>
+      </w:pPr>
+      <w:r>
+        <w:rPr>
+          <w:rFonts w:ascii="Sakkal Majalla" w:hAnsi="Sakkal Majalla" w:cs="Sakkal Majalla"/>
+          <w:sz w:val="28"/>
+          <w:szCs w:val="28"/>
+        </w:rPr>
+        <w:t>=================================================</w:t>
+      </w:r>
+    </w:p>
+    <w:p>
+      <w:pPr>
+        <w:rPr>
+          <w:rFonts w:ascii="Sakkal Majalla" w:hAnsi="Sakkal Majalla" w:cs="Sakkal Majalla"/>
+          <w:sz w:val="28"/>
+          <w:szCs w:val="28"/>
+        </w:rPr>
+      </w:pPr>
+      <w:r>
+        <w:rPr>
+          <w:noProof/>
+        </w:rPr>
+        <w:lastRenderedPageBreak/>
+        <w:drawing>
+          <wp:inline distT="0" distB="0" distL="0" distR="0" wp14:anchorId="771326C2" wp14:editId="63922FC6">
+            <wp:extent cx="6565022" cy="3743325"/>
+            <wp:effectExtent l="0" t="0" r="7620" b="0"/>
+            <wp:docPr id="349308029" name="Picture 1"/>
+            <wp:cNvGraphicFramePr>
+              <a:graphicFrameLocks xmlns:a="http://schemas.openxmlformats.org/drawingml/2006/main" noChangeAspect="1"/>
+            </wp:cNvGraphicFramePr>
+            <a:graphic xmlns:a="http://schemas.openxmlformats.org/drawingml/2006/main">
+              <a:graphicData uri="http://schemas.openxmlformats.org/drawingml/2006/picture">
+                <pic:pic xmlns:pic="http://schemas.openxmlformats.org/drawingml/2006/picture">
+                  <pic:nvPicPr>
+                    <pic:cNvPr id="349308029" name=""/>
+                    <pic:cNvPicPr/>
+                  </pic:nvPicPr>
+                  <pic:blipFill>
+                    <a:blip r:embed="rId10"/>
+                    <a:stretch>
+                      <a:fillRect/>
+                    </a:stretch>
+                  </pic:blipFill>
+                  <pic:spPr>
+                    <a:xfrm>
+                      <a:off x="0" y="0"/>
+                      <a:ext cx="6569903" cy="3746108"/>
+                    </a:xfrm>
+                    <a:prstGeom prst="rect">
+                      <a:avLst/>
+                    </a:prstGeom>
+                  </pic:spPr>
+                </pic:pic>
+              </a:graphicData>
+            </a:graphic>
+          </wp:inline>
+        </w:drawing>
+      </w:r>
+    </w:p>
+    <w:p>
+      <w:pPr>
+        <w:ind w:left="720" w:firstLine="720"/>
+        <w:rPr>
+          <w:rFonts w:ascii="Sakkal Majalla" w:hAnsi="Sakkal Majalla" w:cs="Sakkal Majalla"/>
+          <w:sz w:val="28"/>
+          <w:szCs w:val="28"/>
+        </w:rPr>
+      </w:pPr>
+      <w:r>
+        <w:rPr>
+          <w:rFonts w:ascii="Sakkal Majalla" w:hAnsi="Sakkal Majalla" w:cs="Sakkal Majalla"/>
+          <w:sz w:val="28"/>
+          <w:szCs w:val="28"/>
+        </w:rPr>
+        <w:t>=================================================</w:t>
+      </w:r>
+    </w:p>
+    <w:p>
+      <w:pPr>
+        <w:rPr>
+          <w:rFonts w:ascii="Sakkal Majalla" w:hAnsi="Sakkal Majalla" w:cs="Sakkal Majalla"/>
+          <w:sz w:val="28"/>
+          <w:szCs w:val="28"/>
+        </w:rPr>
+      </w:pPr>
+      <w:r>
+        <w:rPr>
+          <w:rFonts w:ascii="Sakkal Majalla" w:hAnsi="Sakkal Majalla" w:cs="Sakkal Majalla"/>
+          <w:b/>
+          <w:bCs/>
+          <w:color w:val="002060"/>
+          <w:sz w:val="28"/>
+          <w:szCs w:val="28"/>
+        </w:rPr>
+        <w:t>The Control Plane</w:t>
+      </w:r>
+      <w:r>
+        <w:rPr>
+          <w:rFonts w:ascii="Sakkal Majalla" w:hAnsi="Sakkal Majalla" w:cs="Sakkal Majalla"/>
+          <w:color w:val="002060"/>
+          <w:sz w:val="28"/>
+          <w:szCs w:val="28"/>
+        </w:rPr>
+        <w:t xml:space="preserve"> </w:t>
+      </w:r>
+      <w:r>
+        <w:rPr>
+          <w:rFonts w:ascii="Sakkal Majalla" w:hAnsi="Sakkal Majalla" w:cs="Sakkal Majalla"/>
+          <w:sz w:val="28"/>
+          <w:szCs w:val="28"/>
+        </w:rPr>
+        <w:t xml:space="preserve">components </w:t>
+      </w:r>
+      <w:r>
+        <w:rPr>
+          <w:rFonts w:ascii="Sakkal Majalla" w:hAnsi="Sakkal Majalla" w:cs="Sakkal Majalla"/>
+          <w:b/>
+          <w:bCs/>
+          <w:color w:val="002060"/>
+          <w:sz w:val="28"/>
+          <w:szCs w:val="28"/>
+        </w:rPr>
+        <w:t>run in containers in the VM or directly in your host OS</w:t>
+      </w:r>
+      <w:r>
+        <w:rPr>
+          <w:rFonts w:ascii="Sakkal Majalla" w:hAnsi="Sakkal Majalla" w:cs="Sakkal Majalla"/>
+          <w:color w:val="002060"/>
+          <w:sz w:val="28"/>
+          <w:szCs w:val="28"/>
+        </w:rPr>
+        <w:t xml:space="preserve"> </w:t>
+      </w:r>
+      <w:r>
+        <w:rPr>
+          <w:rFonts w:ascii="Sakkal Majalla" w:hAnsi="Sakkal Majalla" w:cs="Sakkal Majalla"/>
+          <w:sz w:val="28"/>
+          <w:szCs w:val="28"/>
+        </w:rPr>
+        <w:t xml:space="preserve">if you used the </w:t>
+      </w:r>
+      <w:r>
+        <w:rPr>
+          <w:rFonts w:ascii="Sakkal Majalla" w:hAnsi="Sakkal Majalla" w:cs="Sakkal Majalla"/>
+          <w:sz w:val="28"/>
+          <w:szCs w:val="28"/>
+        </w:rPr>
+        <w:t xml:space="preserve">                   </w:t>
+      </w:r>
+      <w:r>
+        <w:rPr>
+          <w:rFonts w:ascii="Sakkal Majalla" w:hAnsi="Sakkal Majalla" w:cs="Sakkal Majalla"/>
+          <w:b/>
+          <w:bCs/>
+          <w:color w:val="002060"/>
+          <w:sz w:val="28"/>
+          <w:szCs w:val="28"/>
+        </w:rPr>
+        <w:t>--vm-driver none</w:t>
+      </w:r>
+      <w:r>
+        <w:rPr>
+          <w:rFonts w:ascii="Sakkal Majalla" w:hAnsi="Sakkal Majalla" w:cs="Sakkal Majalla"/>
+          <w:color w:val="002060"/>
+          <w:sz w:val="28"/>
+          <w:szCs w:val="28"/>
+        </w:rPr>
+        <w:t xml:space="preserve"> </w:t>
+      </w:r>
+      <w:r>
+        <w:rPr>
+          <w:rFonts w:ascii="Sakkal Majalla" w:hAnsi="Sakkal Majalla" w:cs="Sakkal Majalla"/>
+          <w:sz w:val="28"/>
+          <w:szCs w:val="28"/>
+        </w:rPr>
+        <w:t>option to create the cluster. The Kubelet runs directly in the VM or your host’s operating system. It runs the applications you deploy in the cluster via the Docker Daemon.</w:t>
+      </w:r>
+    </w:p>
+    <w:p>
+      <w:pPr>
+        <w:ind w:left="720" w:firstLine="720"/>
+        <w:rPr>
+          <w:rFonts w:ascii="Sakkal Majalla" w:hAnsi="Sakkal Majalla" w:cs="Sakkal Majalla"/>
+          <w:sz w:val="28"/>
+          <w:szCs w:val="28"/>
+        </w:rPr>
+      </w:pPr>
+      <w:r>
+        <w:rPr>
+          <w:rFonts w:ascii="Sakkal Majalla" w:hAnsi="Sakkal Majalla" w:cs="Sakkal Majalla"/>
+          <w:sz w:val="28"/>
+          <w:szCs w:val="28"/>
+        </w:rPr>
+        <w:t>=================================================</w:t>
+      </w:r>
+    </w:p>
+    <w:p>
+      <w:pPr>
+        <w:rPr>
+          <w:rFonts w:ascii="Sakkal Majalla" w:hAnsi="Sakkal Majalla" w:cs="Sakkal Majalla"/>
+          <w:sz w:val="28"/>
+          <w:szCs w:val="28"/>
+        </w:rPr>
+      </w:pPr>
+      <w:r>
+        <w:rPr>
+          <w:rFonts w:ascii="Sakkal Majalla" w:hAnsi="Sakkal Majalla" w:cs="Sakkal Majalla"/>
+          <w:b/>
+          <w:bCs/>
+          <w:color w:val="C9C9C9" w:themeColor="accent3" w:themeTint="99"/>
+          <w:sz w:val="28"/>
+          <w:szCs w:val="28"/>
+        </w:rPr>
+        <w:t>K</w:t>
+      </w:r>
+      <w:r>
+        <w:rPr>
+          <w:rFonts w:ascii="Sakkal Majalla" w:hAnsi="Sakkal Majalla" w:cs="Sakkal Majalla"/>
+          <w:b/>
+          <w:bCs/>
+          <w:color w:val="C9C9C9" w:themeColor="accent3" w:themeTint="99"/>
+          <w:sz w:val="28"/>
+          <w:szCs w:val="28"/>
+        </w:rPr>
+        <w:t>ind</w:t>
+      </w:r>
+      <w:r>
+        <w:rPr>
+          <w:rFonts w:ascii="Sakkal Majalla" w:hAnsi="Sakkal Majalla" w:cs="Sakkal Majalla"/>
+          <w:color w:val="C9C9C9" w:themeColor="accent3" w:themeTint="99"/>
+          <w:sz w:val="28"/>
+          <w:szCs w:val="28"/>
+        </w:rPr>
+        <w:t xml:space="preserve"> </w:t>
+      </w:r>
+      <w:r>
+        <w:rPr>
+          <w:rFonts w:ascii="Sakkal Majalla" w:hAnsi="Sakkal Majalla" w:cs="Sakkal Majalla"/>
+          <w:sz w:val="28"/>
+          <w:szCs w:val="28"/>
+        </w:rPr>
+        <w:t>(</w:t>
+      </w:r>
+      <w:r>
+        <w:rPr>
+          <w:rFonts w:ascii="Sakkal Majalla" w:hAnsi="Sakkal Majalla" w:cs="Sakkal Majalla"/>
+          <w:b/>
+          <w:bCs/>
+          <w:color w:val="C9C9C9" w:themeColor="accent3" w:themeTint="99"/>
+          <w:sz w:val="28"/>
+          <w:szCs w:val="28"/>
+        </w:rPr>
+        <w:t>Kubernetes-in</w:t>
+      </w:r>
+      <w:r>
+        <w:rPr>
+          <w:rFonts w:ascii="Sakkal Majalla" w:hAnsi="Sakkal Majalla" w:cs="Sakkal Majalla"/>
+          <w:b/>
+          <w:bCs/>
+          <w:color w:val="C9C9C9" w:themeColor="accent3" w:themeTint="99"/>
+          <w:sz w:val="28"/>
+          <w:szCs w:val="28"/>
+        </w:rPr>
+        <w:t>-</w:t>
+      </w:r>
+      <w:r>
+        <w:rPr>
+          <w:rFonts w:ascii="Sakkal Majalla" w:hAnsi="Sakkal Majalla" w:cs="Sakkal Majalla"/>
+          <w:b/>
+          <w:bCs/>
+          <w:color w:val="C9C9C9" w:themeColor="accent3" w:themeTint="99"/>
+          <w:sz w:val="28"/>
+          <w:szCs w:val="28"/>
+        </w:rPr>
+        <w:t>Docker</w:t>
+      </w:r>
+      <w:r>
+        <w:rPr>
+          <w:rFonts w:ascii="Sakkal Majalla" w:hAnsi="Sakkal Majalla" w:cs="Sakkal Majalla"/>
+          <w:sz w:val="28"/>
+          <w:szCs w:val="28"/>
+        </w:rPr>
+        <w:t xml:space="preserve">). Instead of running Kubernetes in a virtual machine or directly on the host, kind </w:t>
+      </w:r>
+      <w:r>
+        <w:rPr>
+          <w:rFonts w:ascii="Sakkal Majalla" w:hAnsi="Sakkal Majalla" w:cs="Sakkal Majalla"/>
+          <w:b/>
+          <w:bCs/>
+          <w:color w:val="C9C9C9" w:themeColor="accent3" w:themeTint="99"/>
+          <w:sz w:val="28"/>
+          <w:szCs w:val="28"/>
+        </w:rPr>
+        <w:t>runs each Kubernetes cluster node inside a container</w:t>
+      </w:r>
+      <w:r>
+        <w:rPr>
+          <w:rFonts w:ascii="Sakkal Majalla" w:hAnsi="Sakkal Majalla" w:cs="Sakkal Majalla"/>
+          <w:sz w:val="28"/>
+          <w:szCs w:val="28"/>
+        </w:rPr>
+        <w:t xml:space="preserve">. Unlike Minikube, </w:t>
+      </w:r>
+      <w:r>
+        <w:rPr>
+          <w:rFonts w:ascii="Sakkal Majalla" w:hAnsi="Sakkal Majalla" w:cs="Sakkal Majalla"/>
+          <w:b/>
+          <w:bCs/>
+          <w:color w:val="C9C9C9" w:themeColor="accent3" w:themeTint="99"/>
+          <w:sz w:val="28"/>
+          <w:szCs w:val="28"/>
+        </w:rPr>
+        <w:t>this allows it to create multi-node clusters</w:t>
+      </w:r>
+      <w:r>
+        <w:rPr>
+          <w:rFonts w:ascii="Sakkal Majalla" w:hAnsi="Sakkal Majalla" w:cs="Sakkal Majalla"/>
+          <w:color w:val="C9C9C9" w:themeColor="accent3" w:themeTint="99"/>
+          <w:sz w:val="28"/>
+          <w:szCs w:val="28"/>
+        </w:rPr>
+        <w:t xml:space="preserve"> </w:t>
+      </w:r>
+      <w:r>
+        <w:rPr>
+          <w:rFonts w:ascii="Sakkal Majalla" w:hAnsi="Sakkal Majalla" w:cs="Sakkal Majalla"/>
+          <w:sz w:val="28"/>
+          <w:szCs w:val="28"/>
+        </w:rPr>
+        <w:t>by starting several containers. The actual application containers that you deploy to Kubernetes then run within these node containers.</w:t>
+      </w:r>
+    </w:p>
+    <w:p>
+      <w:pPr>
+        <w:ind w:left="720" w:firstLine="720"/>
+        <w:rPr>
+          <w:rFonts w:ascii="Sakkal Majalla" w:hAnsi="Sakkal Majalla" w:cs="Sakkal Majalla"/>
+          <w:sz w:val="28"/>
+          <w:szCs w:val="28"/>
+        </w:rPr>
+      </w:pPr>
+      <w:r>
+        <w:rPr>
+          <w:rFonts w:ascii="Sakkal Majalla" w:hAnsi="Sakkal Majalla" w:cs="Sakkal Majalla"/>
+          <w:sz w:val="28"/>
+          <w:szCs w:val="28"/>
+        </w:rPr>
+        <w:t>=================================================</w:t>
+      </w:r>
+    </w:p>
+    <w:p>
+      <w:pPr>
+        <w:rPr>
+          <w:rFonts w:ascii="Sakkal Majalla" w:hAnsi="Sakkal Majalla" w:cs="Sakkal Majalla"/>
+          <w:sz w:val="28"/>
+          <w:szCs w:val="28"/>
+        </w:rPr>
+      </w:pPr>
+      <w:r>
+        <w:rPr>
+          <w:noProof/>
+        </w:rPr>
+        <w:lastRenderedPageBreak/>
+        <w:drawing>
+          <wp:inline distT="0" distB="0" distL="0" distR="0" wp14:anchorId="6DAB1C33" wp14:editId="0F841625">
+            <wp:extent cx="5943600" cy="3825240"/>
+            <wp:effectExtent l="0" t="0" r="0" b="3810"/>
+            <wp:docPr id="1295900501" name="Picture 1"/>
+            <wp:cNvGraphicFramePr>
+              <a:graphicFrameLocks xmlns:a="http://schemas.openxmlformats.org/drawingml/2006/main" noChangeAspect="1"/>
+            </wp:cNvGraphicFramePr>
+            <a:graphic xmlns:a="http://schemas.openxmlformats.org/drawingml/2006/main">
+              <a:graphicData uri="http://schemas.openxmlformats.org/drawingml/2006/picture">
+                <pic:pic xmlns:pic="http://schemas.openxmlformats.org/drawingml/2006/picture">
+                  <pic:nvPicPr>
+                    <pic:cNvPr id="1295900501" name=""/>
+                    <pic:cNvPicPr/>
+                  </pic:nvPicPr>
+                  <pic:blipFill>
+                    <a:blip r:embed="rId11"/>
+                    <a:stretch>
+                      <a:fillRect/>
+                    </a:stretch>
+                  </pic:blipFill>
+                  <pic:spPr>
+                    <a:xfrm>
+                      <a:off x="0" y="0"/>
+                      <a:ext cx="5943600" cy="3825240"/>
+                    </a:xfrm>
+                    <a:prstGeom prst="rect">
+                      <a:avLst/>
+                    </a:prstGeom>
+                  </pic:spPr>
+                </pic:pic>
+              </a:graphicData>
+            </a:graphic>
+          </wp:inline>
+        </w:drawing>
+      </w:r>
+    </w:p>
+    <w:p>
+      <w:pPr>
+        <w:ind w:left="720" w:firstLine="720"/>
+        <w:rPr>
+          <w:rFonts w:ascii="Sakkal Majalla" w:hAnsi="Sakkal Majalla" w:cs="Sakkal Majalla"/>
+          <w:sz w:val="28"/>
+          <w:szCs w:val="28"/>
+        </w:rPr>
+      </w:pPr>
+      <w:r>
+        <w:rPr>
+          <w:rFonts w:ascii="Sakkal Majalla" w:hAnsi="Sakkal Majalla" w:cs="Sakkal Majalla"/>
+          <w:sz w:val="28"/>
+          <w:szCs w:val="28"/>
+        </w:rPr>
+        <w:t>=================================================</w:t>
+      </w:r>
+    </w:p>
+    <w:p>
+      <w:pPr>
+        <w:rPr>
+          <w:rFonts w:ascii="Sakkal Majalla" w:hAnsi="Sakkal Majalla" w:cs="Sakkal Majalla"/>
+          <w:sz w:val="28"/>
+          <w:szCs w:val="28"/>
+        </w:rPr>
+      </w:pPr>
+      <w:r>
+        <w:rPr>
+          <w:rFonts w:ascii="Sakkal Majalla" w:hAnsi="Sakkal Majalla" w:cs="Sakkal Majalla"/>
+          <w:sz w:val="28"/>
+          <w:szCs w:val="28"/>
+        </w:rPr>
+        <w:t>A</w:t>
+      </w:r>
+      <w:r>
+        <w:rPr>
+          <w:rFonts w:ascii="Sakkal Majalla" w:hAnsi="Sakkal Majalla" w:cs="Sakkal Majalla"/>
+          <w:sz w:val="28"/>
+          <w:szCs w:val="28"/>
+        </w:rPr>
+        <w:t xml:space="preserve"> process that runs in a container </w:t>
+      </w:r>
+      <w:r>
+        <w:rPr>
+          <w:rFonts w:ascii="Sakkal Majalla" w:hAnsi="Sakkal Majalla" w:cs="Sakkal Majalla"/>
+          <w:b/>
+          <w:bCs/>
+          <w:color w:val="2F5496" w:themeColor="accent1" w:themeShade="BF"/>
+          <w:sz w:val="28"/>
+          <w:szCs w:val="28"/>
+        </w:rPr>
+        <w:t>actually runs in the host OS</w:t>
+      </w:r>
+      <w:r>
+        <w:rPr>
+          <w:rFonts w:ascii="Sakkal Majalla" w:hAnsi="Sakkal Majalla" w:cs="Sakkal Majalla"/>
+          <w:sz w:val="28"/>
+          <w:szCs w:val="28"/>
+        </w:rPr>
+        <w:t xml:space="preserve">. This means that when you run Kubernetes using kind, </w:t>
+      </w:r>
+      <w:r>
+        <w:rPr>
+          <w:rFonts w:ascii="Sakkal Majalla" w:hAnsi="Sakkal Majalla" w:cs="Sakkal Majalla"/>
+          <w:b/>
+          <w:bCs/>
+          <w:color w:val="2F5496" w:themeColor="accent1" w:themeShade="BF"/>
+          <w:sz w:val="28"/>
+          <w:szCs w:val="28"/>
+        </w:rPr>
+        <w:t>all Kubernetes components run in your host OS</w:t>
+      </w:r>
+      <w:r>
+        <w:rPr>
+          <w:rFonts w:ascii="Sakkal Majalla" w:hAnsi="Sakkal Majalla" w:cs="Sakkal Majalla"/>
+          <w:sz w:val="28"/>
+          <w:szCs w:val="28"/>
+        </w:rPr>
+        <w:t>. The applications you deploy to the Kubernetes cluster also run in your host OS.</w:t>
       </w:r>
     </w:p>
     <w:p>

</xml_diff>